<commit_message>
TS 1.1-1.4 Jatai Ghanam Final 30/06/26 Tamil
</commit_message>
<xml_diff>
--- a/TS Jatai Ghanam Project/TS 1.1/TS 1.1 Ghanam Tamil Corrections.docx
+++ b/TS Jatai Ghanam Project/TS 1.1/TS 1.1 Ghanam Tamil Corrections.docx
@@ -62,16 +62,14 @@
         <w:rPr>
           <w:b/>
           <w:bCs/>
-          <w:sz w:val="28"/>
-          <w:szCs w:val="32"/>
+          <w:szCs w:val="24"/>
         </w:rPr>
       </w:pPr>
       <w:r>
         <w:rPr>
           <w:b/>
           <w:bCs/>
-          <w:sz w:val="28"/>
-          <w:szCs w:val="32"/>
+          <w:szCs w:val="24"/>
         </w:rPr>
         <w:t>(ignore those which are already incorporated in your book’s version and date)</w:t>
       </w:r>
@@ -8353,6 +8351,7 @@
                 <w:cs/>
                 <w:lang w:bidi="ta-IN"/>
               </w:rPr>
+              <w:lastRenderedPageBreak/>
               <w:t>ரா</w:t>
             </w:r>
             <w:r>
@@ -48881,6 +48880,7 @@
           <w:szCs w:val="32"/>
           <w:u w:val="single"/>
         </w:rPr>
+        <w:lastRenderedPageBreak/>
         <w:t>===============</w:t>
       </w:r>
     </w:p>

</xml_diff>